<commit_message>
Cập nhật source code cùng với file báo cáo
</commit_message>
<xml_diff>
--- a/documents/Đề 13_20222334-Vũ Văn Tiến.docx
+++ b/documents/Đề 13_20222334-Vũ Văn Tiến.docx
@@ -1404,12 +1404,6 @@
             <w:insideH w:val="single" w:color="auto" w:sz="4" w:space="0"/>
             <w:insideV w:val="single" w:color="auto" w:sz="4" w:space="0"/>
           </w:tblBorders>
-          <w:tblCellMar>
-            <w:top w:w="0" w:type="dxa"/>
-            <w:left w:w="108" w:type="dxa"/>
-            <w:bottom w:w="0" w:type="dxa"/>
-            <w:right w:w="108" w:type="dxa"/>
-          </w:tblCellMar>
         </w:tblPrEx>
         <w:tc>
           <w:tcPr>
@@ -2621,22 +2615,22 @@
           <w:rFonts w:hint="default"/>
           <w:lang w:val="en-US"/>
         </w:rPr>
-        <w:t>Xử lý và phân tích dữ liệu là quá trình thu thập, làm sạch, biến đổi và phân tích dữ liệu nhằm trích xuất thông tin có giá trị phục vụ cho việc ra quyết định.</w:t>
-      </w:r>
-    </w:p>
-    <w:p>
-      <w:pPr>
-        <w:rPr>
-          <w:rFonts w:hint="default"/>
-          <w:lang w:val="en-US"/>
-        </w:rPr>
-      </w:pPr>
-      <w:r>
-        <w:rPr>
-          <w:rFonts w:hint="default"/>
-          <w:lang w:val="en-US"/>
-        </w:rPr>
-        <w:t>- Trong lĩnh vực du lịch, phân tích dữ liệu giúp:</w:t>
+        <w:t>Xử lý và phân tích dữ liệu (Data Processing and Data Analysis) là một quá trình bao gồm nhiều bước liên tiếp nhằm biến đổi dữ liệu thô (raw data) thành thông tin có ý nghĩa, từ đó hỗ trợ cho việc ra quyết định trong thực tiễn. Trong bối cảnh hiện nay, khi dữ liệu ngày càng gia tăng về khối lượng, tốc độ và đa dạng (Big Data), việc phân tích dữ liệu không chỉ dừng lại ở việc mô tả mà còn hướng đến dự đoán và tối ưu hóa.</w:t>
+      </w:r>
+    </w:p>
+    <w:p>
+      <w:pPr>
+        <w:rPr>
+          <w:rFonts w:hint="default"/>
+          <w:lang w:val="en-US"/>
+        </w:rPr>
+      </w:pPr>
+      <w:r>
+        <w:rPr>
+          <w:rFonts w:hint="default"/>
+          <w:lang w:val="en-US"/>
+        </w:rPr>
+        <w:t>- Trong lĩnh vực du lịch, dữ liệu có thể được thu thập từ nhiều nguồn khác nhau như:</w:t>
       </w:r>
     </w:p>
     <w:p>
@@ -2656,7 +2650,7 @@
           <w:rFonts w:hint="default"/>
           <w:lang w:val="en-US"/>
         </w:rPr>
-        <w:t>Hiểu hành vi khách du lịch</w:t>
+        <w:t>Hệ thống đặt phòng khách sạn.</w:t>
       </w:r>
     </w:p>
     <w:p>
@@ -2676,7 +2670,7 @@
           <w:rFonts w:hint="default"/>
           <w:lang w:val="en-US"/>
         </w:rPr>
-        <w:t>Xác định xu hướng du lịch theo thời gian</w:t>
+        <w:t>Ứng dụng đặt vé máy bay.</w:t>
       </w:r>
     </w:p>
     <w:p>
@@ -2696,7 +2690,7 @@
           <w:rFonts w:hint="default"/>
           <w:lang w:val="en-US"/>
         </w:rPr>
-        <w:t>Dự đoán nhu cầu và doanh thu</w:t>
+        <w:t>Dữ liệu từ mạng xã hội.</w:t>
       </w:r>
     </w:p>
     <w:p>
@@ -2716,124 +2710,224 @@
           <w:rFonts w:hint="default"/>
           <w:lang w:val="en-US"/>
         </w:rPr>
-        <w:t>Tối ưu hóa chiến lược kinh doanh</w:t>
-      </w:r>
-    </w:p>
-    <w:p>
-      <w:pPr>
-        <w:rPr>
-          <w:rFonts w:hint="default"/>
-          <w:lang w:val="en-US"/>
-        </w:rPr>
-      </w:pPr>
-      <w:r>
-        <w:rPr>
-          <w:rFonts w:hint="default"/>
-          <w:lang w:val="en-US"/>
-        </w:rPr>
-        <w:t>- Quá trình phân tích dữ liệu thường bao gồm các bước:</w:t>
-      </w:r>
-    </w:p>
-    <w:p>
-      <w:pPr>
-        <w:numPr>
-          <w:ilvl w:val="0"/>
-          <w:numId w:val="2"/>
-        </w:numPr>
-        <w:ind w:left="425" w:leftChars="0" w:hanging="425" w:firstLineChars="0"/>
-        <w:rPr>
-          <w:rFonts w:hint="default"/>
-          <w:lang w:val="en-US"/>
-        </w:rPr>
-      </w:pPr>
-      <w:r>
-        <w:rPr>
-          <w:rFonts w:hint="default"/>
-          <w:lang w:val="en-US"/>
-        </w:rPr>
-        <w:t>Thu thập dữ liệu.</w:t>
-      </w:r>
-    </w:p>
-    <w:p>
-      <w:pPr>
-        <w:numPr>
-          <w:ilvl w:val="0"/>
-          <w:numId w:val="2"/>
-        </w:numPr>
-        <w:ind w:left="425" w:leftChars="0" w:hanging="425" w:firstLineChars="0"/>
-        <w:rPr>
-          <w:rFonts w:hint="default"/>
-          <w:lang w:val="en-US"/>
-        </w:rPr>
-      </w:pPr>
-      <w:r>
-        <w:rPr>
-          <w:rFonts w:hint="default"/>
-          <w:lang w:val="en-US"/>
-        </w:rPr>
-        <w:t>Làm sạch dữ liệu.</w:t>
-      </w:r>
-    </w:p>
-    <w:p>
-      <w:pPr>
-        <w:numPr>
-          <w:ilvl w:val="0"/>
-          <w:numId w:val="2"/>
-        </w:numPr>
-        <w:ind w:left="425" w:leftChars="0" w:hanging="425" w:firstLineChars="0"/>
-        <w:rPr>
-          <w:rFonts w:hint="default"/>
-          <w:lang w:val="en-US"/>
-        </w:rPr>
-      </w:pPr>
-      <w:r>
-        <w:rPr>
-          <w:rFonts w:hint="default"/>
-          <w:lang w:val="en-US"/>
-        </w:rPr>
-        <w:t>Phân tích dữ liệu khám phá (EDA).</w:t>
-      </w:r>
-      <w:bookmarkStart w:id="1" w:name="_GoBack"/>
-      <w:bookmarkEnd w:id="1"/>
-    </w:p>
-    <w:p>
-      <w:pPr>
-        <w:numPr>
-          <w:ilvl w:val="0"/>
-          <w:numId w:val="2"/>
-        </w:numPr>
-        <w:ind w:left="425" w:leftChars="0" w:hanging="425" w:firstLineChars="0"/>
-        <w:rPr>
-          <w:rFonts w:hint="default"/>
-          <w:lang w:val="en-US"/>
-        </w:rPr>
-      </w:pPr>
-      <w:r>
-        <w:rPr>
-          <w:rFonts w:hint="default"/>
-          <w:lang w:val="en-US"/>
-        </w:rPr>
-        <w:t>Xây dựng mô hình.</w:t>
-      </w:r>
-    </w:p>
-    <w:p>
-      <w:pPr>
-        <w:numPr>
-          <w:ilvl w:val="0"/>
-          <w:numId w:val="2"/>
-        </w:numPr>
-        <w:ind w:left="425" w:leftChars="0" w:hanging="425" w:firstLineChars="0"/>
-        <w:rPr>
-          <w:rFonts w:hint="default"/>
-          <w:lang w:val="en-US"/>
-        </w:rPr>
-      </w:pPr>
-      <w:r>
-        <w:rPr>
-          <w:rFonts w:hint="default"/>
-          <w:lang w:val="en-US"/>
-        </w:rPr>
-        <w:t>Đánh giá và đưa ra kết luận.</w:t>
+        <w:t>Website du lịch và đánh giá người dùng.</w:t>
+      </w:r>
+    </w:p>
+    <w:p>
+      <w:pPr>
+        <w:numPr>
+          <w:ilvl w:val="0"/>
+          <w:numId w:val="1"/>
+        </w:numPr>
+        <w:ind w:left="0" w:leftChars="0" w:firstLine="0" w:firstLineChars="0"/>
+        <w:rPr>
+          <w:rFonts w:hint="default"/>
+          <w:lang w:val="en-US"/>
+        </w:rPr>
+      </w:pPr>
+      <w:r>
+        <w:rPr>
+          <w:rFonts w:hint="default"/>
+          <w:lang w:val="en-US"/>
+        </w:rPr>
+        <w:t>Dữ liệu từ cơ quan thống kê.</w:t>
+      </w:r>
+    </w:p>
+    <w:p>
+      <w:pPr>
+        <w:numPr>
+          <w:numId w:val="0"/>
+        </w:numPr>
+        <w:ind w:leftChars="0"/>
+        <w:rPr>
+          <w:rFonts w:hint="default"/>
+          <w:lang w:val="en-US"/>
+        </w:rPr>
+      </w:pPr>
+      <w:r>
+        <w:rPr>
+          <w:rFonts w:hint="default"/>
+          <w:lang w:val="en-US"/>
+        </w:rPr>
+        <w:t>- Những dữ liệu này thường có đặc điểm:</w:t>
+      </w:r>
+    </w:p>
+    <w:p>
+      <w:pPr>
+        <w:numPr>
+          <w:ilvl w:val="0"/>
+          <w:numId w:val="1"/>
+        </w:numPr>
+        <w:ind w:left="0" w:leftChars="0" w:firstLine="0" w:firstLineChars="0"/>
+        <w:rPr>
+          <w:rFonts w:hint="default"/>
+          <w:lang w:val="en-US"/>
+        </w:rPr>
+      </w:pPr>
+      <w:r>
+        <w:rPr>
+          <w:rFonts w:hint="default"/>
+          <w:lang w:val="en-US"/>
+        </w:rPr>
+        <w:t>Dữ liệu lớn (large-scale).</w:t>
+      </w:r>
+    </w:p>
+    <w:p>
+      <w:pPr>
+        <w:numPr>
+          <w:ilvl w:val="0"/>
+          <w:numId w:val="1"/>
+        </w:numPr>
+        <w:ind w:left="0" w:leftChars="0" w:firstLine="0" w:firstLineChars="0"/>
+        <w:rPr>
+          <w:rFonts w:hint="default"/>
+          <w:lang w:val="en-US"/>
+        </w:rPr>
+      </w:pPr>
+      <w:r>
+        <w:rPr>
+          <w:rFonts w:hint="default"/>
+          <w:lang w:val="en-US"/>
+        </w:rPr>
+        <w:t>Dữ liệu không đồng nhất (structured &amp; unstructured).</w:t>
+      </w:r>
+    </w:p>
+    <w:p>
+      <w:pPr>
+        <w:numPr>
+          <w:ilvl w:val="0"/>
+          <w:numId w:val="1"/>
+        </w:numPr>
+        <w:ind w:left="0" w:leftChars="0" w:firstLine="0" w:firstLineChars="0"/>
+        <w:rPr>
+          <w:rFonts w:hint="default"/>
+          <w:lang w:val="en-US"/>
+        </w:rPr>
+      </w:pPr>
+      <w:r>
+        <w:rPr>
+          <w:rFonts w:hint="default"/>
+          <w:lang w:val="en-US"/>
+        </w:rPr>
+        <w:t>Có thể chứa nhiều nhiễu và thiếu sót.</w:t>
+      </w:r>
+    </w:p>
+    <w:p>
+      <w:pPr>
+        <w:numPr>
+          <w:numId w:val="0"/>
+        </w:numPr>
+        <w:ind w:leftChars="0"/>
+        <w:rPr>
+          <w:rFonts w:hint="default"/>
+          <w:lang w:val="en-US"/>
+        </w:rPr>
+      </w:pPr>
+      <w:r>
+        <w:rPr>
+          <w:rFonts w:hint="default"/>
+          <w:lang w:val="en-US"/>
+        </w:rPr>
+        <w:t>- Do đó, việc xử lý và phân tích dữ liệu đóng vai trò cực kỳ quan trọng trong việc khai thác giá trị từ dữ liệu.</w:t>
+      </w:r>
+    </w:p>
+    <w:p>
+      <w:pPr>
+        <w:numPr>
+          <w:numId w:val="0"/>
+        </w:numPr>
+        <w:ind w:leftChars="0"/>
+        <w:rPr>
+          <w:rFonts w:hint="default"/>
+          <w:lang w:val="en-US"/>
+        </w:rPr>
+      </w:pPr>
+      <w:r>
+        <w:rPr>
+          <w:rFonts w:hint="default"/>
+          <w:lang w:val="en-US"/>
+        </w:rPr>
+        <w:t>- Phân tích dữ liệu giúp các doanh nghiệp và tổ chức trong ngành du lịch:</w:t>
+      </w:r>
+    </w:p>
+    <w:p>
+      <w:pPr>
+        <w:numPr>
+          <w:ilvl w:val="0"/>
+          <w:numId w:val="1"/>
+        </w:numPr>
+        <w:ind w:left="0" w:leftChars="0" w:firstLine="0" w:firstLineChars="0"/>
+        <w:rPr>
+          <w:rFonts w:hint="default"/>
+          <w:lang w:val="en-US"/>
+        </w:rPr>
+      </w:pPr>
+      <w:r>
+        <w:rPr>
+          <w:rFonts w:hint="default"/>
+          <w:lang w:val="en-US"/>
+        </w:rPr>
+        <w:t>Hiểu hành vi khách du lịch: Phân tích dữ liệu giúp xác định khách hàng đến từ đâu, họ quan tâm đến loại hình du lịch nào, thời gian lưu trú bao lâu và mức chi tiêu ra sao.</w:t>
+      </w:r>
+    </w:p>
+    <w:p>
+      <w:pPr>
+        <w:numPr>
+          <w:ilvl w:val="0"/>
+          <w:numId w:val="1"/>
+        </w:numPr>
+        <w:ind w:left="0" w:leftChars="0" w:firstLine="0" w:firstLineChars="0"/>
+        <w:rPr>
+          <w:rFonts w:hint="default"/>
+          <w:lang w:val="en-US"/>
+        </w:rPr>
+      </w:pPr>
+      <w:r>
+        <w:rPr>
+          <w:rFonts w:hint="default"/>
+          <w:lang w:val="en-US"/>
+        </w:rPr>
+        <w:t>Xác định xu hướng du lịch theo thời gian: Thông qua dữ liệu lịch sử, có thể nhận biết các mùa cao điểm, thấp điểm, hoặc các xu hướng mới như du lịch sinh thái, du lịch trải nghiệm.</w:t>
+      </w:r>
+    </w:p>
+    <w:p>
+      <w:pPr>
+        <w:numPr>
+          <w:ilvl w:val="0"/>
+          <w:numId w:val="1"/>
+        </w:numPr>
+        <w:ind w:left="0" w:leftChars="0" w:firstLine="0" w:firstLineChars="0"/>
+        <w:rPr>
+          <w:rFonts w:hint="default"/>
+          <w:lang w:val="en-US"/>
+        </w:rPr>
+      </w:pPr>
+      <w:r>
+        <w:rPr>
+          <w:rFonts w:hint="default"/>
+          <w:lang w:val="en-US"/>
+        </w:rPr>
+        <w:t>Dự đoán nhu cầu và doanh thu: Áp dụng các mô hình học máy giúp dự báo lượng khách trong tương lai, từ đó hỗ trợ lập kế hoạch kinh doanh và phân bổ nguồn lực hợp lý.</w:t>
+      </w:r>
+    </w:p>
+    <w:p>
+      <w:pPr>
+        <w:numPr>
+          <w:ilvl w:val="0"/>
+          <w:numId w:val="1"/>
+        </w:numPr>
+        <w:ind w:left="0" w:leftChars="0" w:firstLine="0" w:firstLineChars="0"/>
+        <w:rPr>
+          <w:rFonts w:hint="default"/>
+          <w:lang w:val="en-US"/>
+        </w:rPr>
+      </w:pPr>
+      <w:r>
+        <w:rPr>
+          <w:rFonts w:hint="default"/>
+          <w:lang w:val="en-US"/>
+        </w:rPr>
+        <w:t>Tối ưu hóa chiến lược kinh doanh: Dữ liệu giúp doanh nghiệp đưa ra các quyết định chính xác hơn về giá cả, marketing, lựa chọn địa điểm và phát triển dịch vụ.</w:t>
       </w:r>
     </w:p>
     <w:p>
@@ -2859,276 +2953,796 @@
     </w:p>
     <w:p>
       <w:pPr>
-        <w:ind w:firstLine="720" w:firstLineChars="0"/>
-        <w:rPr>
-          <w:rFonts w:hint="default"/>
-          <w:lang w:val="en-US"/>
-        </w:rPr>
-      </w:pPr>
-      <w:r>
-        <w:rPr>
-          <w:rFonts w:hint="default"/>
-          <w:lang w:val="en-US"/>
-        </w:rPr>
-        <w:t>Tiền xử lý dữ liệu (Data Preprocessing) là bước quan trọng nhằm đảm bảo dữ liệu sạch và phù hợp cho việc phân tích.</w:t>
-      </w:r>
-    </w:p>
-    <w:p>
-      <w:pPr>
-        <w:rPr>
-          <w:rFonts w:hint="default"/>
-          <w:lang w:val="en-US"/>
-        </w:rPr>
-      </w:pPr>
-      <w:r>
-        <w:rPr>
-          <w:rFonts w:hint="default"/>
-          <w:lang w:val="en-US"/>
-        </w:rPr>
-        <w:t>- Các bước chính bao gồm:</w:t>
-      </w:r>
-    </w:p>
-    <w:p>
-      <w:pPr>
-        <w:rPr>
-          <w:rFonts w:hint="default"/>
-          <w:lang w:val="en-US"/>
-        </w:rPr>
-      </w:pPr>
-      <w:r>
-        <w:rPr>
-          <w:rFonts w:hint="default"/>
-          <w:lang w:val="en-US"/>
-        </w:rPr>
-        <w:t>1. Xử lý dữ liệu thiếu (Missing Values)</w:t>
-      </w:r>
-    </w:p>
-    <w:p>
-      <w:pPr>
-        <w:numPr>
-          <w:ilvl w:val="0"/>
-          <w:numId w:val="3"/>
-        </w:numPr>
-        <w:ind w:left="0" w:leftChars="0" w:firstLine="0" w:firstLineChars="0"/>
-        <w:rPr>
-          <w:rFonts w:hint="default"/>
-          <w:lang w:val="en-US"/>
-        </w:rPr>
-      </w:pPr>
-      <w:r>
-        <w:rPr>
-          <w:rFonts w:hint="default"/>
-          <w:lang w:val="en-US"/>
-        </w:rPr>
-        <w:t>Loại bỏ các dòng thiếu dữ liệu.</w:t>
-      </w:r>
-    </w:p>
-    <w:p>
-      <w:pPr>
-        <w:numPr>
-          <w:ilvl w:val="0"/>
-          <w:numId w:val="3"/>
-        </w:numPr>
-        <w:ind w:left="0" w:leftChars="0" w:firstLine="0" w:firstLineChars="0"/>
-        <w:rPr>
-          <w:rFonts w:hint="default"/>
-          <w:lang w:val="en-US"/>
-        </w:rPr>
-      </w:pPr>
-      <w:r>
-        <w:rPr>
-          <w:rFonts w:hint="default"/>
-          <w:lang w:val="en-US"/>
-        </w:rPr>
-        <w:t>Thay thế bằng giá trị trung bình, trung vị hoặc mode.</w:t>
-      </w:r>
-    </w:p>
-    <w:p>
-      <w:pPr>
-        <w:rPr>
-          <w:rFonts w:hint="default"/>
-          <w:lang w:val="en-US"/>
-        </w:rPr>
-      </w:pPr>
-      <w:r>
-        <w:rPr>
-          <w:rFonts w:hint="default"/>
-          <w:lang w:val="en-US"/>
-        </w:rPr>
-        <w:t>2. Xử lý dữ liệu trùng lặp (Duplicate Data)</w:t>
-      </w:r>
-    </w:p>
-    <w:p>
-      <w:pPr>
-        <w:numPr>
-          <w:ilvl w:val="0"/>
-          <w:numId w:val="3"/>
-        </w:numPr>
-        <w:ind w:left="0" w:leftChars="0" w:firstLine="0" w:firstLineChars="0"/>
-        <w:rPr>
-          <w:rFonts w:hint="default"/>
-          <w:lang w:val="en-US"/>
-        </w:rPr>
-      </w:pPr>
-      <w:r>
-        <w:rPr>
-          <w:rFonts w:hint="default"/>
-          <w:lang w:val="en-US"/>
-        </w:rPr>
-        <w:t>Loại bỏ các bản ghi bị lặp.</w:t>
-      </w:r>
-    </w:p>
-    <w:p>
-      <w:pPr>
-        <w:rPr>
-          <w:rFonts w:hint="default"/>
-          <w:lang w:val="en-US"/>
-        </w:rPr>
-      </w:pPr>
-      <w:r>
-        <w:rPr>
-          <w:rFonts w:hint="default"/>
-          <w:lang w:val="en-US"/>
-        </w:rPr>
-        <w:t>3. Chuẩn hóa dữ liệu (Normalization/Standardization)</w:t>
-      </w:r>
-    </w:p>
-    <w:p>
-      <w:pPr>
-        <w:numPr>
-          <w:ilvl w:val="0"/>
-          <w:numId w:val="3"/>
-        </w:numPr>
-        <w:ind w:left="0" w:leftChars="0" w:firstLine="0" w:firstLineChars="0"/>
-        <w:rPr>
-          <w:rFonts w:hint="default"/>
-          <w:lang w:val="en-US"/>
-        </w:rPr>
-      </w:pPr>
-      <w:r>
-        <w:rPr>
-          <w:rFonts w:hint="default"/>
-          <w:lang w:val="en-US"/>
-        </w:rPr>
-        <w:t>Đưa dữ liệu về cùng một thang đo.</w:t>
-      </w:r>
-    </w:p>
-    <w:p>
-      <w:pPr>
-        <w:numPr>
-          <w:ilvl w:val="0"/>
-          <w:numId w:val="3"/>
-        </w:numPr>
-        <w:ind w:left="0" w:leftChars="0" w:firstLine="0" w:firstLineChars="0"/>
-        <w:rPr>
-          <w:rFonts w:hint="default"/>
-          <w:lang w:val="en-US"/>
-        </w:rPr>
-      </w:pPr>
-      <w:r>
-        <w:rPr>
-          <w:rFonts w:hint="default"/>
-          <w:lang w:val="en-US"/>
-        </w:rPr>
-        <w:t>Giúp mô hình học máy hoạt động hiệu quả hơn.</w:t>
-      </w:r>
-    </w:p>
-    <w:p>
-      <w:pPr>
-        <w:rPr>
-          <w:rFonts w:hint="default"/>
-          <w:lang w:val="en-US"/>
-        </w:rPr>
-      </w:pPr>
-      <w:r>
-        <w:rPr>
-          <w:rFonts w:hint="default"/>
-          <w:lang w:val="en-US"/>
-        </w:rPr>
-        <w:t>4. Mã hóa dữ liệu (Encoding)</w:t>
-      </w:r>
-    </w:p>
-    <w:p>
-      <w:pPr>
-        <w:numPr>
-          <w:ilvl w:val="0"/>
-          <w:numId w:val="3"/>
-        </w:numPr>
-        <w:ind w:left="0" w:leftChars="0" w:firstLine="0" w:firstLineChars="0"/>
-        <w:rPr>
-          <w:rFonts w:hint="default"/>
-          <w:lang w:val="en-US"/>
-        </w:rPr>
-      </w:pPr>
-      <w:r>
-        <w:rPr>
-          <w:rFonts w:hint="default"/>
-          <w:lang w:val="en-US"/>
-        </w:rPr>
-        <w:t>Chuyển dữ liệu dạng chữ (categorical) sang dạng số.</w:t>
-      </w:r>
-    </w:p>
-    <w:p>
-      <w:pPr>
-        <w:numPr>
-          <w:ilvl w:val="0"/>
-          <w:numId w:val="3"/>
-        </w:numPr>
-        <w:ind w:left="0" w:leftChars="0" w:firstLine="0" w:firstLineChars="0"/>
-        <w:rPr>
-          <w:rFonts w:hint="default"/>
-          <w:lang w:val="en-US"/>
-        </w:rPr>
-      </w:pPr>
-      <w:r>
-        <w:rPr>
-          <w:rFonts w:hint="default"/>
-          <w:lang w:val="en-US"/>
-        </w:rPr>
-        <w:t>Ví dụ: One-hot encoding</w:t>
-      </w:r>
-    </w:p>
-    <w:p>
-      <w:pPr>
-        <w:rPr>
-          <w:rFonts w:hint="default"/>
-          <w:lang w:val="en-US"/>
-        </w:rPr>
-      </w:pPr>
-    </w:p>
-    <w:p>
-      <w:pPr>
-        <w:rPr>
-          <w:rFonts w:hint="default"/>
-          <w:lang w:val="en-US"/>
-        </w:rPr>
-      </w:pPr>
-      <w:r>
-        <w:rPr>
-          <w:rFonts w:hint="default"/>
-          <w:lang w:val="en-US"/>
-        </w:rPr>
-        <w:t>5. Phát hiện và xử lý ngoại lệ (Outliers)</w:t>
-      </w:r>
-    </w:p>
-    <w:p>
-      <w:pPr>
-        <w:numPr>
-          <w:ilvl w:val="0"/>
-          <w:numId w:val="3"/>
-        </w:numPr>
-        <w:ind w:left="0" w:leftChars="0" w:firstLine="0" w:firstLineChars="0"/>
-        <w:rPr>
-          <w:rFonts w:hint="default"/>
-          <w:lang w:val="en-US"/>
-        </w:rPr>
-      </w:pPr>
-      <w:r>
-        <w:rPr>
-          <w:rFonts w:hint="default"/>
-          <w:lang w:val="en-US"/>
-        </w:rPr>
-        <w:t>Sử dụng biểu đồ boxplot hoặc phương pháp thống kê.</w:t>
+        <w:rPr>
+          <w:rFonts w:hint="default"/>
+          <w:lang w:val="en-US"/>
+        </w:rPr>
+      </w:pPr>
+      <w:r>
+        <w:rPr>
+          <w:rFonts w:hint="default"/>
+          <w:lang w:val="en-US"/>
+        </w:rPr>
+        <w:t>1. Thu thập dữ liệu (Data Collection)</w:t>
+      </w:r>
+    </w:p>
+    <w:p>
+      <w:pPr>
+        <w:numPr>
+          <w:ilvl w:val="0"/>
+          <w:numId w:val="1"/>
+        </w:numPr>
+        <w:ind w:left="0" w:leftChars="0" w:firstLine="0" w:firstLineChars="0"/>
+        <w:rPr>
+          <w:rFonts w:hint="default"/>
+          <w:lang w:val="en-US"/>
+        </w:rPr>
+      </w:pPr>
+      <w:r>
+        <w:rPr>
+          <w:rFonts w:hint="default"/>
+          <w:lang w:val="en-US"/>
+        </w:rPr>
+        <w:t>Đây là bước đầu tiên và quan trọng nhất trong toàn bộ quy trình. Dữ liệu có thể được thu thập từ: File CSV, Excel, …</w:t>
+      </w:r>
+    </w:p>
+    <w:p>
+      <w:pPr>
+        <w:numPr>
+          <w:ilvl w:val="0"/>
+          <w:numId w:val="1"/>
+        </w:numPr>
+        <w:ind w:left="0" w:leftChars="0" w:firstLine="0" w:firstLineChars="0"/>
+        <w:rPr>
+          <w:rFonts w:hint="default"/>
+          <w:lang w:val="en-US"/>
+        </w:rPr>
+      </w:pPr>
+      <w:r>
+        <w:rPr>
+          <w:rFonts w:hint="default"/>
+          <w:lang w:val="en-US"/>
+        </w:rPr>
+        <w:t>Chất lượng dữ liệu ở bước này ảnh hưởng trực tiếp đến toàn bộ kết quả phân tích.</w:t>
+      </w:r>
+    </w:p>
+    <w:p>
+      <w:pPr>
+        <w:rPr>
+          <w:rFonts w:hint="default"/>
+          <w:lang w:val="en-US"/>
+        </w:rPr>
+      </w:pPr>
+      <w:r>
+        <w:rPr>
+          <w:rFonts w:hint="default"/>
+          <w:lang w:val="en-US"/>
+        </w:rPr>
+        <w:t>2. Làm sạch dữ liệu (Data Cleaning)</w:t>
+      </w:r>
+    </w:p>
+    <w:p>
+      <w:pPr>
+        <w:rPr>
+          <w:rFonts w:hint="default"/>
+          <w:lang w:val="en-US"/>
+        </w:rPr>
+      </w:pPr>
+      <w:r>
+        <w:rPr>
+          <w:rFonts w:hint="default"/>
+          <w:lang w:val="en-US"/>
+        </w:rPr>
+        <w:t>- Dữ liệu thô thường chứa nhiều lỗi như:</w:t>
+      </w:r>
+    </w:p>
+    <w:p>
+      <w:pPr>
+        <w:numPr>
+          <w:ilvl w:val="0"/>
+          <w:numId w:val="1"/>
+        </w:numPr>
+        <w:ind w:left="0" w:leftChars="0" w:firstLine="0" w:firstLineChars="0"/>
+        <w:rPr>
+          <w:rFonts w:hint="default"/>
+          <w:lang w:val="en-US"/>
+        </w:rPr>
+      </w:pPr>
+      <w:r>
+        <w:rPr>
+          <w:rFonts w:hint="default"/>
+          <w:lang w:val="en-US"/>
+        </w:rPr>
+        <w:t>Giá trị bị thiếu (missing values).</w:t>
+      </w:r>
+    </w:p>
+    <w:p>
+      <w:pPr>
+        <w:numPr>
+          <w:ilvl w:val="0"/>
+          <w:numId w:val="1"/>
+        </w:numPr>
+        <w:ind w:left="0" w:leftChars="0" w:firstLine="0" w:firstLineChars="0"/>
+        <w:rPr>
+          <w:rFonts w:hint="default"/>
+          <w:lang w:val="en-US"/>
+        </w:rPr>
+      </w:pPr>
+      <w:r>
+        <w:rPr>
+          <w:rFonts w:hint="default"/>
+          <w:lang w:val="en-US"/>
+        </w:rPr>
+        <w:t>Dữ liệu trùng lặp.</w:t>
+      </w:r>
+    </w:p>
+    <w:p>
+      <w:pPr>
+        <w:numPr>
+          <w:ilvl w:val="0"/>
+          <w:numId w:val="1"/>
+        </w:numPr>
+        <w:ind w:left="0" w:leftChars="0" w:firstLine="0" w:firstLineChars="0"/>
+        <w:rPr>
+          <w:rFonts w:hint="default"/>
+          <w:lang w:val="en-US"/>
+        </w:rPr>
+      </w:pPr>
+      <w:r>
+        <w:rPr>
+          <w:rFonts w:hint="default"/>
+          <w:lang w:val="en-US"/>
+        </w:rPr>
+        <w:t>Sai định dạng.</w:t>
+      </w:r>
+    </w:p>
+    <w:p>
+      <w:pPr>
+        <w:numPr>
+          <w:ilvl w:val="0"/>
+          <w:numId w:val="1"/>
+        </w:numPr>
+        <w:ind w:left="0" w:leftChars="0" w:firstLine="0" w:firstLineChars="0"/>
+        <w:rPr>
+          <w:rFonts w:hint="default"/>
+          <w:lang w:val="en-US"/>
+        </w:rPr>
+      </w:pPr>
+      <w:r>
+        <w:rPr>
+          <w:rFonts w:hint="default"/>
+          <w:lang w:val="en-US"/>
+        </w:rPr>
+        <w:t>Nhiễu (noise).</w:t>
+      </w:r>
+    </w:p>
+    <w:p>
+      <w:pPr>
+        <w:rPr>
+          <w:rFonts w:hint="default"/>
+          <w:lang w:val="en-US"/>
+        </w:rPr>
+      </w:pPr>
+      <w:r>
+        <w:rPr>
+          <w:rFonts w:hint="default"/>
+          <w:lang w:val="en-US"/>
+        </w:rPr>
+        <w:t>- Các kỹ thuật làm sạch bao gồm:</w:t>
+      </w:r>
+    </w:p>
+    <w:p>
+      <w:pPr>
+        <w:numPr>
+          <w:ilvl w:val="0"/>
+          <w:numId w:val="1"/>
+        </w:numPr>
+        <w:ind w:left="0" w:leftChars="0" w:firstLine="0" w:firstLineChars="0"/>
+        <w:rPr>
+          <w:rFonts w:hint="default"/>
+          <w:lang w:val="en-US"/>
+        </w:rPr>
+      </w:pPr>
+      <w:r>
+        <w:rPr>
+          <w:rFonts w:hint="default"/>
+          <w:lang w:val="en-US"/>
+        </w:rPr>
+        <w:t>Xóa hoặc thay thế dữ liệu thiếu.</w:t>
+      </w:r>
+    </w:p>
+    <w:p>
+      <w:pPr>
+        <w:numPr>
+          <w:ilvl w:val="0"/>
+          <w:numId w:val="1"/>
+        </w:numPr>
+        <w:ind w:left="0" w:leftChars="0" w:firstLine="0" w:firstLineChars="0"/>
+        <w:rPr>
+          <w:rFonts w:hint="default"/>
+          <w:lang w:val="en-US"/>
+        </w:rPr>
+      </w:pPr>
+      <w:r>
+        <w:rPr>
+          <w:rFonts w:hint="default"/>
+          <w:lang w:val="en-US"/>
+        </w:rPr>
+        <w:t>Chuẩn hóa định dạng (ngày tháng, số liệu,...).</w:t>
+      </w:r>
+    </w:p>
+    <w:p>
+      <w:pPr>
+        <w:numPr>
+          <w:ilvl w:val="0"/>
+          <w:numId w:val="1"/>
+        </w:numPr>
+        <w:ind w:left="0" w:leftChars="0" w:firstLine="0" w:firstLineChars="0"/>
+        <w:rPr>
+          <w:rFonts w:hint="default"/>
+          <w:lang w:val="en-US"/>
+        </w:rPr>
+      </w:pPr>
+      <w:r>
+        <w:rPr>
+          <w:rFonts w:hint="default"/>
+          <w:lang w:val="en-US"/>
+        </w:rPr>
+        <w:t>Loại bỏ dữ liệu bất thường.</w:t>
+      </w:r>
+    </w:p>
+    <w:p>
+      <w:pPr>
+        <w:rPr>
+          <w:rFonts w:hint="default"/>
+          <w:lang w:val="en-US"/>
+        </w:rPr>
+      </w:pPr>
+      <w:r>
+        <w:rPr>
+          <w:rFonts w:hint="default" w:ascii="Arial" w:hAnsi="Arial" w:cs="Arial"/>
+          <w:lang w:val="en-US"/>
+        </w:rPr>
+        <w:t>→</w:t>
+      </w:r>
+      <w:r>
+        <w:rPr>
+          <w:rFonts w:hint="default"/>
+          <w:lang w:val="en-US"/>
+        </w:rPr>
+        <w:t xml:space="preserve"> Đây là bước quan trọng để đảm bảo tính chính xác của phân tích.</w:t>
+      </w:r>
+    </w:p>
+    <w:p>
+      <w:pPr>
+        <w:rPr>
+          <w:rFonts w:hint="default"/>
+          <w:lang w:val="en-US"/>
+        </w:rPr>
+      </w:pPr>
+      <w:r>
+        <w:rPr>
+          <w:rFonts w:hint="default"/>
+          <w:lang w:val="en-US"/>
+        </w:rPr>
+        <w:t>3. Phân tích dữ liệu khám phá (Exploratory Data Analysis - EDA)</w:t>
+      </w:r>
+    </w:p>
+    <w:p>
+      <w:pPr>
+        <w:rPr>
+          <w:rFonts w:hint="default"/>
+          <w:lang w:val="en-US"/>
+        </w:rPr>
+      </w:pPr>
+      <w:r>
+        <w:rPr>
+          <w:rFonts w:hint="default"/>
+          <w:lang w:val="en-US"/>
+        </w:rPr>
+        <w:t>- EDA giúp hiểu rõ cấu trúc và đặc điểm của dữ liệu thông qua:</w:t>
+      </w:r>
+    </w:p>
+    <w:p>
+      <w:pPr>
+        <w:numPr>
+          <w:ilvl w:val="0"/>
+          <w:numId w:val="1"/>
+        </w:numPr>
+        <w:ind w:left="0" w:leftChars="0" w:firstLine="0" w:firstLineChars="0"/>
+        <w:rPr>
+          <w:rFonts w:hint="default"/>
+          <w:lang w:val="en-US"/>
+        </w:rPr>
+      </w:pPr>
+      <w:r>
+        <w:rPr>
+          <w:rFonts w:hint="default"/>
+          <w:lang w:val="en-US"/>
+        </w:rPr>
+        <w:t>Thống kê mô tả (mean, median, std,...).</w:t>
+      </w:r>
+    </w:p>
+    <w:p>
+      <w:pPr>
+        <w:numPr>
+          <w:ilvl w:val="0"/>
+          <w:numId w:val="1"/>
+        </w:numPr>
+        <w:ind w:left="0" w:leftChars="0" w:firstLine="0" w:firstLineChars="0"/>
+        <w:rPr>
+          <w:rFonts w:hint="default"/>
+          <w:lang w:val="en-US"/>
+        </w:rPr>
+      </w:pPr>
+      <w:r>
+        <w:rPr>
+          <w:rFonts w:hint="default"/>
+          <w:lang w:val="en-US"/>
+        </w:rPr>
+        <w:t>Kiểm tra phân phối dữ liệu.</w:t>
+      </w:r>
+    </w:p>
+    <w:p>
+      <w:pPr>
+        <w:numPr>
+          <w:ilvl w:val="0"/>
+          <w:numId w:val="1"/>
+        </w:numPr>
+        <w:ind w:left="0" w:leftChars="0" w:firstLine="0" w:firstLineChars="0"/>
+        <w:rPr>
+          <w:rFonts w:hint="default"/>
+          <w:lang w:val="en-US"/>
+        </w:rPr>
+      </w:pPr>
+      <w:r>
+        <w:rPr>
+          <w:rFonts w:hint="default"/>
+          <w:lang w:val="en-US"/>
+        </w:rPr>
+        <w:t>Tìm mối quan hệ giữa các biến.</w:t>
+      </w:r>
+    </w:p>
+    <w:p>
+      <w:pPr>
+        <w:rPr>
+          <w:rFonts w:hint="default"/>
+          <w:lang w:val="en-US"/>
+        </w:rPr>
+      </w:pPr>
+      <w:r>
+        <w:rPr>
+          <w:rFonts w:hint="default"/>
+          <w:lang w:val="en-US"/>
+        </w:rPr>
+        <w:t>- Các kỹ thuật thường dùng:</w:t>
+      </w:r>
+    </w:p>
+    <w:p>
+      <w:pPr>
+        <w:numPr>
+          <w:ilvl w:val="0"/>
+          <w:numId w:val="1"/>
+        </w:numPr>
+        <w:ind w:left="0" w:leftChars="0" w:firstLine="0" w:firstLineChars="0"/>
+        <w:rPr>
+          <w:rFonts w:hint="default"/>
+          <w:lang w:val="en-US"/>
+        </w:rPr>
+      </w:pPr>
+      <w:r>
+        <w:rPr>
+          <w:rFonts w:hint="default"/>
+          <w:lang w:val="en-US"/>
+        </w:rPr>
+        <w:t>Vẽ biểu đồ (histogram, scatter, bar chart,...).</w:t>
+      </w:r>
+    </w:p>
+    <w:p>
+      <w:pPr>
+        <w:numPr>
+          <w:ilvl w:val="0"/>
+          <w:numId w:val="1"/>
+        </w:numPr>
+        <w:ind w:left="0" w:leftChars="0" w:firstLine="0" w:firstLineChars="0"/>
+        <w:rPr>
+          <w:rFonts w:hint="default"/>
+          <w:lang w:val="en-US"/>
+        </w:rPr>
+      </w:pPr>
+      <w:r>
+        <w:rPr>
+          <w:rFonts w:hint="default"/>
+          <w:lang w:val="en-US"/>
+        </w:rPr>
+        <w:t>Phân tích tương quan (correlation).</w:t>
+      </w:r>
+    </w:p>
+    <w:p>
+      <w:pPr>
+        <w:numPr>
+          <w:ilvl w:val="0"/>
+          <w:numId w:val="1"/>
+        </w:numPr>
+        <w:ind w:left="0" w:leftChars="0" w:firstLine="0" w:firstLineChars="0"/>
+        <w:rPr>
+          <w:rFonts w:hint="default"/>
+          <w:lang w:val="en-US"/>
+        </w:rPr>
+      </w:pPr>
+      <w:r>
+        <w:rPr>
+          <w:rFonts w:hint="default"/>
+          <w:lang w:val="en-US"/>
+        </w:rPr>
+        <w:t>EDA giúp phát hiện các insight ban đầu và định hướng cho bước xây dựng mô hình.</w:t>
+      </w:r>
+    </w:p>
+    <w:p>
+      <w:pPr>
+        <w:rPr>
+          <w:rFonts w:hint="default"/>
+          <w:lang w:val="en-US"/>
+        </w:rPr>
+      </w:pPr>
+    </w:p>
+    <w:p>
+      <w:pPr>
+        <w:rPr>
+          <w:rFonts w:hint="default"/>
+          <w:lang w:val="en-US"/>
+        </w:rPr>
+      </w:pPr>
+      <w:r>
+        <w:rPr>
+          <w:rFonts w:hint="default"/>
+          <w:lang w:val="en-US"/>
+        </w:rPr>
+        <w:t>4. Xây dựng mô hình (Model Building)</w:t>
+      </w:r>
+    </w:p>
+    <w:p>
+      <w:pPr>
+        <w:rPr>
+          <w:rFonts w:hint="default"/>
+          <w:lang w:val="en-US"/>
+        </w:rPr>
+      </w:pPr>
+      <w:r>
+        <w:rPr>
+          <w:rFonts w:hint="default"/>
+          <w:lang w:val="en-US"/>
+        </w:rPr>
+        <w:t>- Sau khi hiểu dữ liệu, bước tiếp theo là xây dựng mô hình để:</w:t>
+      </w:r>
+    </w:p>
+    <w:p>
+      <w:pPr>
+        <w:numPr>
+          <w:ilvl w:val="0"/>
+          <w:numId w:val="1"/>
+        </w:numPr>
+        <w:ind w:left="0" w:leftChars="0" w:firstLine="0" w:firstLineChars="0"/>
+        <w:rPr>
+          <w:rFonts w:hint="default"/>
+          <w:lang w:val="en-US"/>
+        </w:rPr>
+      </w:pPr>
+      <w:r>
+        <w:rPr>
+          <w:rFonts w:hint="default"/>
+          <w:lang w:val="en-US"/>
+        </w:rPr>
+        <w:t>Dự đoán (Regression).</w:t>
+      </w:r>
+    </w:p>
+    <w:p>
+      <w:pPr>
+        <w:numPr>
+          <w:ilvl w:val="0"/>
+          <w:numId w:val="1"/>
+        </w:numPr>
+        <w:ind w:left="0" w:leftChars="0" w:firstLine="0" w:firstLineChars="0"/>
+        <w:rPr>
+          <w:rFonts w:hint="default"/>
+          <w:lang w:val="en-US"/>
+        </w:rPr>
+      </w:pPr>
+      <w:r>
+        <w:rPr>
+          <w:rFonts w:hint="default"/>
+          <w:lang w:val="en-US"/>
+        </w:rPr>
+        <w:t>Phân loại (Classification).</w:t>
+      </w:r>
+    </w:p>
+    <w:p>
+      <w:pPr>
+        <w:numPr>
+          <w:ilvl w:val="0"/>
+          <w:numId w:val="1"/>
+        </w:numPr>
+        <w:ind w:left="0" w:leftChars="0" w:firstLine="0" w:firstLineChars="0"/>
+        <w:rPr>
+          <w:rFonts w:hint="default"/>
+          <w:lang w:val="en-US"/>
+        </w:rPr>
+      </w:pPr>
+      <w:r>
+        <w:rPr>
+          <w:rFonts w:hint="default"/>
+          <w:lang w:val="en-US"/>
+        </w:rPr>
+        <w:t>Phân cụm (Clustering).</w:t>
+      </w:r>
+    </w:p>
+    <w:p>
+      <w:pPr>
+        <w:rPr>
+          <w:rFonts w:hint="default"/>
+          <w:lang w:val="en-US"/>
+        </w:rPr>
+      </w:pPr>
+      <w:r>
+        <w:rPr>
+          <w:rFonts w:hint="default"/>
+          <w:lang w:val="en-US"/>
+        </w:rPr>
+        <w:t>- Một số thuật toán phổ biến:</w:t>
+      </w:r>
+    </w:p>
+    <w:p>
+      <w:pPr>
+        <w:numPr>
+          <w:ilvl w:val="0"/>
+          <w:numId w:val="1"/>
+        </w:numPr>
+        <w:ind w:left="0" w:leftChars="0" w:firstLine="0" w:firstLineChars="0"/>
+        <w:rPr>
+          <w:rFonts w:hint="default"/>
+          <w:lang w:val="en-US"/>
+        </w:rPr>
+      </w:pPr>
+      <w:r>
+        <w:rPr>
+          <w:rFonts w:hint="default"/>
+          <w:lang w:val="en-US"/>
+        </w:rPr>
+        <w:t>Linear Regression.</w:t>
+      </w:r>
+    </w:p>
+    <w:p>
+      <w:pPr>
+        <w:numPr>
+          <w:ilvl w:val="0"/>
+          <w:numId w:val="1"/>
+        </w:numPr>
+        <w:ind w:left="0" w:leftChars="0" w:firstLine="0" w:firstLineChars="0"/>
+        <w:rPr>
+          <w:rFonts w:hint="default"/>
+          <w:lang w:val="en-US"/>
+        </w:rPr>
+      </w:pPr>
+      <w:r>
+        <w:rPr>
+          <w:rFonts w:hint="default"/>
+          <w:lang w:val="en-US"/>
+        </w:rPr>
+        <w:t>Random Forest.</w:t>
+      </w:r>
+    </w:p>
+    <w:p>
+      <w:pPr>
+        <w:numPr>
+          <w:ilvl w:val="0"/>
+          <w:numId w:val="1"/>
+        </w:numPr>
+        <w:ind w:left="0" w:leftChars="0" w:firstLine="0" w:firstLineChars="0"/>
+        <w:rPr>
+          <w:rFonts w:hint="default"/>
+          <w:lang w:val="en-US"/>
+        </w:rPr>
+      </w:pPr>
+      <w:r>
+        <w:rPr>
+          <w:rFonts w:hint="default"/>
+          <w:lang w:val="en-US"/>
+        </w:rPr>
+        <w:t>Decision Tree.</w:t>
+      </w:r>
+    </w:p>
+    <w:p>
+      <w:pPr>
+        <w:rPr>
+          <w:rFonts w:hint="default"/>
+          <w:lang w:val="en-US"/>
+        </w:rPr>
+      </w:pPr>
+      <w:r>
+        <w:rPr>
+          <w:rFonts w:hint="default" w:ascii="Arial" w:hAnsi="Arial" w:cs="Arial"/>
+          <w:lang w:val="en-US"/>
+        </w:rPr>
+        <w:t>→</w:t>
+      </w:r>
+      <w:r>
+        <w:rPr>
+          <w:rFonts w:hint="default"/>
+          <w:lang w:val="en-US"/>
+        </w:rPr>
+        <w:t xml:space="preserve"> Mô hình được huấn luyện trên tập dữ liệu train và kiểm tra trên tập test.</w:t>
+      </w:r>
+    </w:p>
+    <w:p>
+      <w:pPr>
+        <w:rPr>
+          <w:rFonts w:hint="default"/>
+          <w:lang w:val="en-US"/>
+        </w:rPr>
+      </w:pPr>
+      <w:r>
+        <w:rPr>
+          <w:rFonts w:hint="default"/>
+          <w:lang w:val="en-US"/>
+        </w:rPr>
+        <w:t>5. Đánh giá và đưa ra kết luận (Evaluation &amp; Conclusion)</w:t>
+      </w:r>
+    </w:p>
+    <w:p>
+      <w:pPr>
+        <w:rPr>
+          <w:rFonts w:hint="default"/>
+          <w:lang w:val="en-US"/>
+        </w:rPr>
+      </w:pPr>
+      <w:r>
+        <w:rPr>
+          <w:rFonts w:hint="default"/>
+          <w:lang w:val="en-US"/>
+        </w:rPr>
+        <w:t>- Sau khi xây dựng mô hình, cần đánh giá hiệu quả bằng các chỉ số như:</w:t>
+      </w:r>
+    </w:p>
+    <w:p>
+      <w:pPr>
+        <w:numPr>
+          <w:ilvl w:val="0"/>
+          <w:numId w:val="1"/>
+        </w:numPr>
+        <w:ind w:left="0" w:leftChars="0" w:firstLine="0" w:firstLineChars="0"/>
+        <w:rPr>
+          <w:rFonts w:hint="default"/>
+          <w:lang w:val="en-US"/>
+        </w:rPr>
+      </w:pPr>
+      <w:r>
+        <w:rPr>
+          <w:rFonts w:hint="default"/>
+          <w:lang w:val="en-US"/>
+        </w:rPr>
+        <w:t>MAE (Mean Absolute Error).</w:t>
+      </w:r>
+    </w:p>
+    <w:p>
+      <w:pPr>
+        <w:numPr>
+          <w:ilvl w:val="0"/>
+          <w:numId w:val="1"/>
+        </w:numPr>
+        <w:ind w:left="0" w:leftChars="0" w:firstLine="0" w:firstLineChars="0"/>
+        <w:rPr>
+          <w:rFonts w:hint="default"/>
+          <w:lang w:val="en-US"/>
+        </w:rPr>
+      </w:pPr>
+      <w:r>
+        <w:rPr>
+          <w:rFonts w:hint="default"/>
+          <w:lang w:val="en-US"/>
+        </w:rPr>
+        <w:t>RMSE (Root Mean Squared Error).</w:t>
+      </w:r>
+    </w:p>
+    <w:p>
+      <w:pPr>
+        <w:numPr>
+          <w:ilvl w:val="0"/>
+          <w:numId w:val="1"/>
+        </w:numPr>
+        <w:ind w:left="0" w:leftChars="0" w:firstLine="0" w:firstLineChars="0"/>
+        <w:rPr>
+          <w:rFonts w:hint="default"/>
+          <w:lang w:val="en-US"/>
+        </w:rPr>
+      </w:pPr>
+      <w:r>
+        <w:rPr>
+          <w:rFonts w:hint="default"/>
+          <w:lang w:val="en-US"/>
+        </w:rPr>
+        <w:t>R² Score.</w:t>
+      </w:r>
+    </w:p>
+    <w:p>
+      <w:pPr>
+        <w:rPr>
+          <w:rFonts w:hint="default"/>
+          <w:lang w:val="en-US"/>
+        </w:rPr>
+      </w:pPr>
+      <w:r>
+        <w:rPr>
+          <w:rFonts w:hint="default" w:ascii="Arial" w:hAnsi="Arial" w:cs="Arial"/>
+          <w:lang w:val="en-US"/>
+        </w:rPr>
+        <w:t>→</w:t>
+      </w:r>
+      <w:r>
+        <w:rPr>
+          <w:rFonts w:hint="default"/>
+          <w:lang w:val="en-US"/>
+        </w:rPr>
+        <w:t xml:space="preserve"> Dựa trên kết quả đánh giá, có thể:</w:t>
+      </w:r>
+    </w:p>
+    <w:p>
+      <w:pPr>
+        <w:numPr>
+          <w:ilvl w:val="0"/>
+          <w:numId w:val="1"/>
+        </w:numPr>
+        <w:ind w:left="0" w:leftChars="0" w:firstLine="0" w:firstLineChars="0"/>
+        <w:rPr>
+          <w:rFonts w:hint="default"/>
+          <w:lang w:val="en-US"/>
+        </w:rPr>
+      </w:pPr>
+      <w:r>
+        <w:rPr>
+          <w:rFonts w:hint="default"/>
+          <w:lang w:val="en-US"/>
+        </w:rPr>
+        <w:t>Điều chỉnh mô hình.</w:t>
+      </w:r>
+    </w:p>
+    <w:p>
+      <w:pPr>
+        <w:numPr>
+          <w:ilvl w:val="0"/>
+          <w:numId w:val="1"/>
+        </w:numPr>
+        <w:ind w:left="0" w:leftChars="0" w:firstLine="0" w:firstLineChars="0"/>
+        <w:rPr>
+          <w:rFonts w:hint="default"/>
+          <w:lang w:val="en-US"/>
+        </w:rPr>
+      </w:pPr>
+      <w:r>
+        <w:rPr>
+          <w:rFonts w:hint="default"/>
+          <w:lang w:val="en-US"/>
+        </w:rPr>
+        <w:t>So sánh các mô hình khác nhau.</w:t>
+      </w:r>
+    </w:p>
+    <w:p>
+      <w:pPr>
+        <w:numPr>
+          <w:ilvl w:val="0"/>
+          <w:numId w:val="1"/>
+        </w:numPr>
+        <w:ind w:left="0" w:leftChars="0" w:firstLine="0" w:firstLineChars="0"/>
+        <w:rPr>
+          <w:rFonts w:hint="default"/>
+          <w:lang w:val="en-US"/>
+        </w:rPr>
+      </w:pPr>
+      <w:r>
+        <w:rPr>
+          <w:rFonts w:hint="default"/>
+          <w:lang w:val="en-US"/>
+        </w:rPr>
+        <w:t>Đưa ra kết luận và insight.</w:t>
       </w:r>
     </w:p>
     <w:p>
@@ -3207,7 +3821,7 @@
       <w:pPr>
         <w:numPr>
           <w:ilvl w:val="0"/>
-          <w:numId w:val="3"/>
+          <w:numId w:val="2"/>
         </w:numPr>
         <w:ind w:left="0" w:leftChars="0" w:firstLine="0" w:firstLineChars="0"/>
         <w:rPr>
@@ -3227,7 +3841,7 @@
       <w:pPr>
         <w:numPr>
           <w:ilvl w:val="0"/>
-          <w:numId w:val="3"/>
+          <w:numId w:val="2"/>
         </w:numPr>
         <w:ind w:left="0" w:leftChars="0" w:firstLine="0" w:firstLineChars="0"/>
         <w:rPr>
@@ -3247,7 +3861,7 @@
       <w:pPr>
         <w:numPr>
           <w:ilvl w:val="0"/>
-          <w:numId w:val="3"/>
+          <w:numId w:val="2"/>
         </w:numPr>
         <w:ind w:left="0" w:leftChars="0" w:firstLine="0" w:firstLineChars="0"/>
         <w:rPr>
@@ -3282,7 +3896,7 @@
       <w:pPr>
         <w:numPr>
           <w:ilvl w:val="0"/>
-          <w:numId w:val="3"/>
+          <w:numId w:val="2"/>
         </w:numPr>
         <w:ind w:left="0" w:leftChars="0" w:firstLine="0" w:firstLineChars="0"/>
         <w:rPr>
@@ -3302,7 +3916,7 @@
       <w:pPr>
         <w:numPr>
           <w:ilvl w:val="0"/>
-          <w:numId w:val="3"/>
+          <w:numId w:val="2"/>
         </w:numPr>
         <w:ind w:left="0" w:leftChars="0" w:firstLine="0" w:firstLineChars="0"/>
         <w:rPr>
@@ -3375,7 +3989,7 @@
       <w:pPr>
         <w:numPr>
           <w:ilvl w:val="0"/>
-          <w:numId w:val="4"/>
+          <w:numId w:val="3"/>
         </w:numPr>
         <w:ind w:left="0" w:leftChars="0" w:firstLine="0" w:firstLineChars="0"/>
         <w:rPr>
@@ -3395,7 +4009,7 @@
       <w:pPr>
         <w:numPr>
           <w:ilvl w:val="0"/>
-          <w:numId w:val="4"/>
+          <w:numId w:val="3"/>
         </w:numPr>
         <w:ind w:left="0" w:leftChars="0" w:firstLine="0" w:firstLineChars="0"/>
         <w:rPr>
@@ -3430,7 +4044,7 @@
       <w:pPr>
         <w:numPr>
           <w:ilvl w:val="0"/>
-          <w:numId w:val="4"/>
+          <w:numId w:val="3"/>
         </w:numPr>
         <w:ind w:left="0" w:leftChars="0" w:firstLine="0" w:firstLineChars="0"/>
         <w:rPr>
@@ -3450,7 +4064,7 @@
       <w:pPr>
         <w:numPr>
           <w:ilvl w:val="0"/>
-          <w:numId w:val="4"/>
+          <w:numId w:val="3"/>
         </w:numPr>
         <w:ind w:left="0" w:leftChars="0" w:firstLine="0" w:firstLineChars="0"/>
         <w:rPr>
@@ -3470,7 +4084,7 @@
       <w:pPr>
         <w:numPr>
           <w:ilvl w:val="0"/>
-          <w:numId w:val="4"/>
+          <w:numId w:val="3"/>
         </w:numPr>
         <w:ind w:left="0" w:leftChars="0" w:firstLine="0" w:firstLineChars="0"/>
         <w:rPr>
@@ -3505,7 +4119,7 @@
       <w:pPr>
         <w:numPr>
           <w:ilvl w:val="0"/>
-          <w:numId w:val="4"/>
+          <w:numId w:val="3"/>
         </w:numPr>
         <w:ind w:left="0" w:leftChars="0" w:firstLine="0" w:firstLineChars="0"/>
         <w:rPr>
@@ -3525,7 +4139,7 @@
       <w:pPr>
         <w:numPr>
           <w:ilvl w:val="0"/>
-          <w:numId w:val="4"/>
+          <w:numId w:val="3"/>
         </w:numPr>
         <w:ind w:left="0" w:leftChars="0" w:firstLine="0" w:firstLineChars="0"/>
         <w:rPr>
@@ -3598,7 +4212,7 @@
       <w:pPr>
         <w:numPr>
           <w:ilvl w:val="0"/>
-          <w:numId w:val="4"/>
+          <w:numId w:val="3"/>
         </w:numPr>
         <w:ind w:left="0" w:leftChars="0" w:firstLine="0" w:firstLineChars="0"/>
         <w:rPr>
@@ -3618,7 +4232,7 @@
       <w:pPr>
         <w:numPr>
           <w:ilvl w:val="0"/>
-          <w:numId w:val="4"/>
+          <w:numId w:val="3"/>
         </w:numPr>
         <w:ind w:left="0" w:leftChars="0" w:firstLine="0" w:firstLineChars="0"/>
         <w:rPr>
@@ -3638,7 +4252,7 @@
       <w:pPr>
         <w:numPr>
           <w:ilvl w:val="0"/>
-          <w:numId w:val="4"/>
+          <w:numId w:val="3"/>
         </w:numPr>
         <w:ind w:left="0" w:leftChars="0" w:firstLine="0" w:firstLineChars="0"/>
         <w:rPr>
@@ -3658,7 +4272,7 @@
       <w:pPr>
         <w:numPr>
           <w:ilvl w:val="0"/>
-          <w:numId w:val="4"/>
+          <w:numId w:val="3"/>
         </w:numPr>
         <w:ind w:left="0" w:leftChars="0" w:firstLine="0" w:firstLineChars="0"/>
         <w:rPr>
@@ -3693,7 +4307,7 @@
       <w:pPr>
         <w:numPr>
           <w:ilvl w:val="0"/>
-          <w:numId w:val="4"/>
+          <w:numId w:val="3"/>
         </w:numPr>
         <w:ind w:left="0" w:leftChars="0" w:firstLine="0" w:firstLineChars="0"/>
         <w:rPr>
@@ -3713,7 +4327,7 @@
       <w:pPr>
         <w:numPr>
           <w:ilvl w:val="0"/>
-          <w:numId w:val="4"/>
+          <w:numId w:val="3"/>
         </w:numPr>
         <w:ind w:left="0" w:leftChars="0" w:firstLine="0" w:firstLineChars="0"/>
         <w:rPr>
@@ -3733,7 +4347,7 @@
       <w:pPr>
         <w:numPr>
           <w:ilvl w:val="0"/>
-          <w:numId w:val="4"/>
+          <w:numId w:val="3"/>
         </w:numPr>
         <w:ind w:left="0" w:leftChars="0" w:firstLine="0" w:firstLineChars="0"/>
         <w:rPr>
@@ -3802,7 +4416,7 @@
       <w:pPr>
         <w:numPr>
           <w:ilvl w:val="0"/>
-          <w:numId w:val="4"/>
+          <w:numId w:val="3"/>
         </w:numPr>
         <w:ind w:left="0" w:leftChars="0" w:firstLine="0" w:firstLineChars="0"/>
         <w:rPr>
@@ -3822,7 +4436,7 @@
       <w:pPr>
         <w:numPr>
           <w:ilvl w:val="0"/>
-          <w:numId w:val="4"/>
+          <w:numId w:val="3"/>
         </w:numPr>
         <w:ind w:left="0" w:leftChars="0" w:firstLine="0" w:firstLineChars="0"/>
         <w:rPr>
@@ -3842,7 +4456,7 @@
       <w:pPr>
         <w:numPr>
           <w:ilvl w:val="0"/>
-          <w:numId w:val="4"/>
+          <w:numId w:val="3"/>
         </w:numPr>
         <w:ind w:left="0" w:leftChars="0" w:firstLine="0" w:firstLineChars="0"/>
         <w:rPr>
@@ -3877,7 +4491,7 @@
       <w:pPr>
         <w:numPr>
           <w:ilvl w:val="0"/>
-          <w:numId w:val="4"/>
+          <w:numId w:val="3"/>
         </w:numPr>
         <w:ind w:left="0" w:leftChars="0" w:firstLine="0" w:firstLineChars="0"/>
         <w:rPr>
@@ -3897,7 +4511,7 @@
       <w:pPr>
         <w:numPr>
           <w:ilvl w:val="0"/>
-          <w:numId w:val="4"/>
+          <w:numId w:val="3"/>
         </w:numPr>
         <w:ind w:left="0" w:leftChars="0" w:firstLine="0" w:firstLineChars="0"/>
         <w:rPr>
@@ -3917,7 +4531,7 @@
       <w:pPr>
         <w:numPr>
           <w:ilvl w:val="0"/>
-          <w:numId w:val="4"/>
+          <w:numId w:val="3"/>
         </w:numPr>
         <w:ind w:left="0" w:leftChars="0" w:firstLine="0" w:firstLineChars="0"/>
         <w:rPr>
@@ -3937,7 +4551,7 @@
       <w:pPr>
         <w:numPr>
           <w:ilvl w:val="0"/>
-          <w:numId w:val="4"/>
+          <w:numId w:val="3"/>
         </w:numPr>
         <w:ind w:left="0" w:leftChars="0" w:firstLine="0" w:firstLineChars="0"/>
         <w:rPr>
@@ -3972,7 +4586,7 @@
       <w:pPr>
         <w:numPr>
           <w:ilvl w:val="0"/>
-          <w:numId w:val="4"/>
+          <w:numId w:val="3"/>
         </w:numPr>
         <w:ind w:left="0" w:leftChars="0" w:firstLine="0" w:firstLineChars="0"/>
         <w:rPr>
@@ -3992,7 +4606,7 @@
       <w:pPr>
         <w:numPr>
           <w:ilvl w:val="0"/>
-          <w:numId w:val="4"/>
+          <w:numId w:val="3"/>
         </w:numPr>
         <w:ind w:left="0" w:leftChars="0" w:firstLine="0" w:firstLineChars="0"/>
         <w:rPr>
@@ -4011,6 +4625,7 @@
     <w:p>
       <w:pPr>
         <w:numPr>
+          <w:ilvl w:val="0"/>
           <w:numId w:val="0"/>
         </w:numPr>
         <w:ind w:leftChars="0"/>
@@ -4466,7 +5081,7 @@
       <w:pPr>
         <w:numPr>
           <w:ilvl w:val="0"/>
-          <w:numId w:val="4"/>
+          <w:numId w:val="3"/>
         </w:numPr>
         <w:ind w:left="0" w:leftChars="0" w:firstLine="0" w:firstLineChars="0"/>
         <w:rPr>
@@ -4501,7 +5116,7 @@
       <w:pPr>
         <w:numPr>
           <w:ilvl w:val="0"/>
-          <w:numId w:val="4"/>
+          <w:numId w:val="3"/>
         </w:numPr>
         <w:ind w:left="0" w:leftChars="0" w:firstLine="0" w:firstLineChars="0"/>
         <w:rPr>
@@ -4521,7 +5136,7 @@
       <w:pPr>
         <w:numPr>
           <w:ilvl w:val="0"/>
-          <w:numId w:val="4"/>
+          <w:numId w:val="3"/>
         </w:numPr>
         <w:ind w:left="0" w:leftChars="0" w:firstLine="0" w:firstLineChars="0"/>
         <w:rPr>
@@ -4556,7 +5171,7 @@
       <w:pPr>
         <w:numPr>
           <w:ilvl w:val="0"/>
-          <w:numId w:val="4"/>
+          <w:numId w:val="3"/>
         </w:numPr>
         <w:ind w:left="0" w:leftChars="0" w:firstLine="0" w:firstLineChars="0"/>
         <w:rPr>
@@ -4576,7 +5191,7 @@
       <w:pPr>
         <w:numPr>
           <w:ilvl w:val="0"/>
-          <w:numId w:val="4"/>
+          <w:numId w:val="3"/>
         </w:numPr>
         <w:ind w:left="0" w:leftChars="0" w:firstLine="0" w:firstLineChars="0"/>
         <w:rPr>
@@ -4611,7 +5226,7 @@
       <w:pPr>
         <w:numPr>
           <w:ilvl w:val="0"/>
-          <w:numId w:val="4"/>
+          <w:numId w:val="3"/>
         </w:numPr>
         <w:ind w:left="0" w:leftChars="0" w:firstLine="0" w:firstLineChars="0"/>
         <w:rPr>
@@ -4631,7 +5246,7 @@
       <w:pPr>
         <w:numPr>
           <w:ilvl w:val="0"/>
-          <w:numId w:val="4"/>
+          <w:numId w:val="3"/>
         </w:numPr>
         <w:ind w:left="0" w:leftChars="0" w:firstLine="0" w:firstLineChars="0"/>
         <w:rPr>
@@ -4666,7 +5281,7 @@
       <w:pPr>
         <w:numPr>
           <w:ilvl w:val="0"/>
-          <w:numId w:val="4"/>
+          <w:numId w:val="3"/>
         </w:numPr>
         <w:ind w:left="0" w:leftChars="0" w:firstLine="0" w:firstLineChars="0"/>
         <w:rPr>
@@ -4701,7 +5316,7 @@
       <w:pPr>
         <w:numPr>
           <w:ilvl w:val="0"/>
-          <w:numId w:val="4"/>
+          <w:numId w:val="3"/>
         </w:numPr>
         <w:ind w:left="0" w:leftChars="0" w:firstLine="0" w:firstLineChars="0"/>
         <w:rPr>
@@ -4721,13 +5336,19 @@
       <w:pPr>
         <w:numPr>
           <w:ilvl w:val="0"/>
-          <w:numId w:val="4"/>
-        </w:numPr>
-        <w:ind w:left="0" w:leftChars="0" w:firstLine="0" w:firstLineChars="0"/>
-        <w:rPr>
-          <w:rFonts w:hint="default"/>
-          <w:lang w:val="en-US"/>
-        </w:rPr>
+          <w:numId w:val="3"/>
+        </w:numPr>
+        <w:ind w:left="0" w:leftChars="0" w:firstLine="0" w:firstLineChars="0"/>
+        <w:rPr>
+          <w:rFonts w:hint="default"/>
+          <w:lang w:val="en-US"/>
+        </w:rPr>
+        <w:sectPr>
+          <w:pgSz w:w="11906" w:h="16838"/>
+          <w:pgMar w:top="1440" w:right="1800" w:bottom="1440" w:left="1800" w:header="720" w:footer="720" w:gutter="0"/>
+          <w:cols w:space="720" w:num="1"/>
+          <w:docGrid w:linePitch="360" w:charSpace="0"/>
+        </w:sectPr>
       </w:pPr>
       <w:r>
         <w:rPr>
@@ -4735,6 +5356,321 @@
           <w:lang w:val="en-US"/>
         </w:rPr>
         <w:t>Đề xuất hướng phát triển</w:t>
+      </w:r>
+    </w:p>
+    <w:p>
+      <w:pPr>
+        <w:numPr>
+          <w:numId w:val="0"/>
+        </w:numPr>
+        <w:ind w:leftChars="0"/>
+        <w:jc w:val="center"/>
+        <w:rPr>
+          <w:rFonts w:hint="default"/>
+          <w:b/>
+          <w:bCs/>
+          <w:sz w:val="32"/>
+          <w:szCs w:val="22"/>
+          <w:lang w:val="en-US"/>
+        </w:rPr>
+      </w:pPr>
+      <w:r>
+        <w:rPr>
+          <w:rFonts w:hint="default"/>
+          <w:b/>
+          <w:bCs/>
+          <w:sz w:val="32"/>
+          <w:szCs w:val="22"/>
+          <w:lang w:val="en-US"/>
+        </w:rPr>
+        <w:t>CHƯƠNG III: THỰC NGHỆM</w:t>
+      </w:r>
+    </w:p>
+    <w:p>
+      <w:pPr>
+        <w:numPr>
+          <w:numId w:val="0"/>
+        </w:numPr>
+        <w:ind w:leftChars="0"/>
+        <w:rPr>
+          <w:rFonts w:hint="default"/>
+          <w:lang w:val="en-US"/>
+        </w:rPr>
+      </w:pPr>
+      <w:r>
+        <w:rPr>
+          <w:rFonts w:hint="default"/>
+          <w:lang w:val="en-US"/>
+        </w:rPr>
+        <w:t>3.1 Mô tả bài toán và dữ liệu thực nghiệm</w:t>
+      </w:r>
+    </w:p>
+    <w:p>
+      <w:pPr>
+        <w:numPr>
+          <w:numId w:val="0"/>
+        </w:numPr>
+        <w:ind w:leftChars="0"/>
+        <w:rPr>
+          <w:rFonts w:hint="default"/>
+          <w:lang w:val="en-US"/>
+        </w:rPr>
+      </w:pPr>
+      <w:r>
+        <w:rPr>
+          <w:rFonts w:hint="default"/>
+          <w:lang w:val="en-US"/>
+        </w:rPr>
+        <w:t>3.2 Phân tích và khảo sát dữ liệu ban đầu</w:t>
+      </w:r>
+    </w:p>
+    <w:p>
+      <w:pPr>
+        <w:numPr>
+          <w:numId w:val="0"/>
+        </w:numPr>
+        <w:ind w:leftChars="0"/>
+        <w:rPr>
+          <w:bCs/>
+          <w:sz w:val="26"/>
+          <w:szCs w:val="26"/>
+        </w:rPr>
+      </w:pPr>
+      <w:r>
+        <w:rPr>
+          <w:rFonts w:hint="default"/>
+          <w:lang w:val="en-US"/>
+        </w:rPr>
+        <w:t xml:space="preserve">3.3 </w:t>
+      </w:r>
+      <w:r>
+        <w:rPr>
+          <w:bCs/>
+          <w:sz w:val="26"/>
+          <w:szCs w:val="26"/>
+        </w:rPr>
+        <w:t>Tiền xử lý dữ liệu</w:t>
+      </w:r>
+      <w:bookmarkStart w:id="1" w:name="_GoBack"/>
+      <w:bookmarkEnd w:id="1"/>
+    </w:p>
+    <w:p>
+      <w:pPr>
+        <w:numPr>
+          <w:numId w:val="0"/>
+        </w:numPr>
+        <w:ind w:leftChars="0"/>
+        <w:rPr>
+          <w:bCs/>
+          <w:sz w:val="26"/>
+          <w:szCs w:val="26"/>
+        </w:rPr>
+      </w:pPr>
+      <w:r>
+        <w:rPr>
+          <w:rFonts w:hint="default"/>
+          <w:bCs/>
+          <w:sz w:val="26"/>
+          <w:szCs w:val="26"/>
+          <w:lang w:val="en-US"/>
+        </w:rPr>
+        <w:t xml:space="preserve">3.4 </w:t>
+      </w:r>
+      <w:r>
+        <w:rPr>
+          <w:bCs/>
+          <w:sz w:val="26"/>
+          <w:szCs w:val="26"/>
+        </w:rPr>
+        <w:t>Trực quan hóa dữ liệu</w:t>
+      </w:r>
+    </w:p>
+    <w:p>
+      <w:pPr>
+        <w:numPr>
+          <w:numId w:val="0"/>
+        </w:numPr>
+        <w:ind w:leftChars="0"/>
+        <w:rPr>
+          <w:bCs/>
+          <w:sz w:val="26"/>
+          <w:szCs w:val="26"/>
+        </w:rPr>
+      </w:pPr>
+      <w:r>
+        <w:rPr>
+          <w:rFonts w:hint="default"/>
+          <w:bCs/>
+          <w:sz w:val="26"/>
+          <w:szCs w:val="26"/>
+          <w:lang w:val="en-US"/>
+        </w:rPr>
+        <w:t xml:space="preserve">3.5 </w:t>
+      </w:r>
+      <w:r>
+        <w:rPr>
+          <w:bCs/>
+          <w:sz w:val="26"/>
+          <w:szCs w:val="26"/>
+        </w:rPr>
+        <w:t>Phân tích dữ liệu /Xây dựng mô hình</w:t>
+      </w:r>
+    </w:p>
+    <w:p>
+      <w:pPr>
+        <w:numPr>
+          <w:numId w:val="0"/>
+        </w:numPr>
+        <w:ind w:leftChars="0"/>
+        <w:rPr>
+          <w:bCs/>
+          <w:sz w:val="26"/>
+          <w:szCs w:val="26"/>
+        </w:rPr>
+        <w:sectPr>
+          <w:pgSz w:w="11906" w:h="16838"/>
+          <w:pgMar w:top="1440" w:right="1800" w:bottom="1440" w:left="1800" w:header="720" w:footer="720" w:gutter="0"/>
+          <w:cols w:space="720" w:num="1"/>
+          <w:docGrid w:linePitch="360" w:charSpace="0"/>
+        </w:sectPr>
+      </w:pPr>
+      <w:r>
+        <w:rPr>
+          <w:rFonts w:hint="default"/>
+          <w:bCs/>
+          <w:sz w:val="26"/>
+          <w:szCs w:val="26"/>
+          <w:lang w:val="en-US"/>
+        </w:rPr>
+        <w:t xml:space="preserve">3.6 </w:t>
+      </w:r>
+      <w:r>
+        <w:rPr>
+          <w:bCs/>
+          <w:sz w:val="26"/>
+          <w:szCs w:val="26"/>
+        </w:rPr>
+        <w:t>Kết quả thực nghiệm và đánh giá</w:t>
+      </w:r>
+    </w:p>
+    <w:p>
+      <w:pPr>
+        <w:numPr>
+          <w:numId w:val="0"/>
+        </w:numPr>
+        <w:ind w:leftChars="0"/>
+        <w:rPr>
+          <w:rFonts w:hint="default"/>
+          <w:bCs/>
+          <w:sz w:val="26"/>
+          <w:szCs w:val="26"/>
+          <w:lang w:val="en-US"/>
+        </w:rPr>
+        <w:sectPr>
+          <w:pgSz w:w="11906" w:h="16838"/>
+          <w:pgMar w:top="1440" w:right="1800" w:bottom="1440" w:left="1800" w:header="720" w:footer="720" w:gutter="0"/>
+          <w:cols w:space="720" w:num="1"/>
+          <w:docGrid w:linePitch="360" w:charSpace="0"/>
+        </w:sectPr>
+      </w:pPr>
+    </w:p>
+    <w:p>
+      <w:pPr>
+        <w:numPr>
+          <w:numId w:val="0"/>
+        </w:numPr>
+        <w:ind w:leftChars="0"/>
+        <w:rPr>
+          <w:rFonts w:hint="default"/>
+          <w:bCs/>
+          <w:sz w:val="26"/>
+          <w:szCs w:val="26"/>
+          <w:lang w:val="en-US"/>
+        </w:rPr>
+        <w:sectPr>
+          <w:pgSz w:w="11906" w:h="16838"/>
+          <w:pgMar w:top="1440" w:right="1800" w:bottom="1440" w:left="1800" w:header="720" w:footer="720" w:gutter="0"/>
+          <w:cols w:space="720" w:num="1"/>
+          <w:docGrid w:linePitch="360" w:charSpace="0"/>
+        </w:sectPr>
+      </w:pPr>
+    </w:p>
+    <w:p>
+      <w:pPr>
+        <w:numPr>
+          <w:numId w:val="0"/>
+        </w:numPr>
+        <w:ind w:leftChars="0"/>
+        <w:rPr>
+          <w:rFonts w:hint="default"/>
+          <w:bCs/>
+          <w:sz w:val="26"/>
+          <w:szCs w:val="26"/>
+          <w:lang w:val="en-US"/>
+        </w:rPr>
+        <w:sectPr>
+          <w:pgSz w:w="11906" w:h="16838"/>
+          <w:pgMar w:top="1440" w:right="1800" w:bottom="1440" w:left="1800" w:header="720" w:footer="720" w:gutter="0"/>
+          <w:cols w:space="720" w:num="1"/>
+          <w:docGrid w:linePitch="360" w:charSpace="0"/>
+        </w:sectPr>
+      </w:pPr>
+    </w:p>
+    <w:p>
+      <w:pPr>
+        <w:numPr>
+          <w:numId w:val="0"/>
+        </w:numPr>
+        <w:ind w:leftChars="0"/>
+        <w:rPr>
+          <w:rFonts w:hint="default"/>
+          <w:bCs/>
+          <w:sz w:val="26"/>
+          <w:szCs w:val="26"/>
+          <w:lang w:val="en-US"/>
+        </w:rPr>
+      </w:pPr>
+      <w:r>
+        <w:rPr>
+          <w:rFonts w:hint="default"/>
+          <w:bCs/>
+          <w:sz w:val="26"/>
+          <w:szCs w:val="26"/>
+          <w:lang w:val="en-US"/>
+        </w:rPr>
+        <w:t>CHƯƠNG IV: KẾT LUẬN</w:t>
+      </w:r>
+    </w:p>
+    <w:p>
+      <w:pPr>
+        <w:numPr>
+          <w:numId w:val="0"/>
+        </w:numPr>
+        <w:ind w:leftChars="0"/>
+        <w:rPr>
+          <w:rFonts w:hint="default"/>
+          <w:bCs/>
+          <w:sz w:val="26"/>
+          <w:szCs w:val="26"/>
+          <w:lang w:val="en-US"/>
+        </w:rPr>
+      </w:pPr>
+      <w:r>
+        <w:rPr>
+          <w:rFonts w:hint="default"/>
+          <w:bCs/>
+          <w:sz w:val="26"/>
+          <w:szCs w:val="26"/>
+          <w:lang w:val="en-US"/>
+        </w:rPr>
+        <w:t xml:space="preserve">4.1 </w:t>
+      </w:r>
+      <w:r>
+        <w:rPr>
+          <w:sz w:val="26"/>
+          <w:szCs w:val="26"/>
+        </w:rPr>
+        <w:t>Kết quả đạt được, hạn chế và hướng phát triển</w:t>
       </w:r>
     </w:p>
     <w:sectPr>
@@ -4821,26 +5757,6 @@
     </w:lvl>
   </w:abstractNum>
   <w:abstractNum w:abstractNumId="1">
-    <w:nsid w:val="039DD8DA"/>
-    <w:multiLevelType w:val="singleLevel"/>
-    <w:tmpl w:val="039DD8DA"/>
-    <w:lvl w:ilvl="0" w:tentative="0">
-      <w:start w:val="1"/>
-      <w:numFmt w:val="decimal"/>
-      <w:lvlText w:val="%1."/>
-      <w:lvlJc w:val="left"/>
-      <w:pPr>
-        <w:tabs>
-          <w:tab w:val="left" w:pos="425"/>
-        </w:tabs>
-        <w:ind w:left="425" w:leftChars="0" w:hanging="425" w:firstLineChars="0"/>
-      </w:pPr>
-      <w:rPr>
-        <w:rFonts w:hint="default"/>
-      </w:rPr>
-    </w:lvl>
-  </w:abstractNum>
-  <w:abstractNum w:abstractNumId="2">
     <w:nsid w:val="68241D82"/>
     <w:multiLevelType w:val="singleLevel"/>
     <w:tmpl w:val="68241D82"/>
@@ -4861,7 +5777,7 @@
       </w:rPr>
     </w:lvl>
   </w:abstractNum>
-  <w:abstractNum w:abstractNumId="3">
+  <w:abstractNum w:abstractNumId="2">
     <w:nsid w:val="7A778E84"/>
     <w:multiLevelType w:val="singleLevel"/>
     <w:tmpl w:val="7A778E84"/>
@@ -4883,15 +5799,12 @@
     </w:lvl>
   </w:abstractNum>
   <w:num w:numId="1">
+    <w:abstractNumId w:val="1"/>
+  </w:num>
+  <w:num w:numId="2">
     <w:abstractNumId w:val="2"/>
   </w:num>
-  <w:num w:numId="2">
-    <w:abstractNumId w:val="1"/>
-  </w:num>
   <w:num w:numId="3">
-    <w:abstractNumId w:val="3"/>
-  </w:num>
-  <w:num w:numId="4">
     <w:abstractNumId w:val="0"/>
   </w:num>
 </w:numbering>
@@ -5473,6 +6386,11 @@
     <customSectPr/>
     <customSectPr/>
     <customSectPr/>
+    <customSectPr/>
+    <customSectPr/>
+    <customSectPr/>
+    <customSectPr/>
+    <customSectPr/>
   </customSectProps>
   <customShpExts>
     <customShpInfo spid="_x0000_s1026" textRotate="1"/>

</xml_diff>

<commit_message>
Tái cấu trúc lại toàn bộ dự án và cập nhật README.md
</commit_message>
<xml_diff>
--- a/documents/Đề 13_20222334-Vũ Văn Tiến.docx
+++ b/documents/Đề 13_20222334-Vũ Văn Tiến.docx
@@ -11,6 +11,8 @@
           <w:docGrid w:linePitch="360" w:charSpace="0"/>
         </w:sectPr>
       </w:pPr>
+      <w:bookmarkStart w:id="1" w:name="_GoBack"/>
+      <w:bookmarkEnd w:id="1"/>
       <w:bookmarkStart w:id="0" w:name="_Hlk198739230"/>
       <w:bookmarkEnd w:id="0"/>
       <w:r>
@@ -204,7 +206,7 @@
                                 <w:szCs w:val="30"/>
                                 <w:lang w:val="en-US"/>
                               </w:rPr>
-                              <w:t>CHUYÊN ĐỀ 3</w:t>
+                              <w:t>CHUYÊN ĐỀ TỐT NGHIỆP 3</w:t>
                             </w:r>
                           </w:p>
                           <w:p>
@@ -828,7 +830,7 @@
                           <w:szCs w:val="30"/>
                           <w:lang w:val="en-US"/>
                         </w:rPr>
-                        <w:t>CHUYÊN ĐỀ 3</w:t>
+                        <w:t>CHUYÊN ĐỀ TỐT NGHIỆP 3</w:t>
                       </w:r>
                     </w:p>
                     <w:p>
@@ -1404,6 +1406,12 @@
             <w:insideH w:val="single" w:color="auto" w:sz="4" w:space="0"/>
             <w:insideV w:val="single" w:color="auto" w:sz="4" w:space="0"/>
           </w:tblBorders>
+          <w:tblCellMar>
+            <w:top w:w="0" w:type="dxa"/>
+            <w:left w:w="108" w:type="dxa"/>
+            <w:bottom w:w="0" w:type="dxa"/>
+            <w:right w:w="108" w:type="dxa"/>
+          </w:tblCellMar>
         </w:tblPrEx>
         <w:tc>
           <w:tcPr>
@@ -2736,6 +2744,7 @@
     <w:p>
       <w:pPr>
         <w:numPr>
+          <w:ilvl w:val="0"/>
           <w:numId w:val="0"/>
         </w:numPr>
         <w:ind w:leftChars="0"/>
@@ -2815,6 +2824,7 @@
     <w:p>
       <w:pPr>
         <w:numPr>
+          <w:ilvl w:val="0"/>
           <w:numId w:val="0"/>
         </w:numPr>
         <w:ind w:leftChars="0"/>
@@ -2834,6 +2844,7 @@
     <w:p>
       <w:pPr>
         <w:numPr>
+          <w:ilvl w:val="0"/>
           <w:numId w:val="0"/>
         </w:numPr>
         <w:ind w:leftChars="0"/>
@@ -5361,6 +5372,7 @@
     <w:p>
       <w:pPr>
         <w:numPr>
+          <w:ilvl w:val="0"/>
           <w:numId w:val="0"/>
         </w:numPr>
         <w:ind w:leftChars="0"/>
@@ -5389,6 +5401,7 @@
     <w:p>
       <w:pPr>
         <w:numPr>
+          <w:ilvl w:val="0"/>
           <w:numId w:val="0"/>
         </w:numPr>
         <w:ind w:leftChars="0"/>
@@ -5408,6 +5421,7 @@
     <w:p>
       <w:pPr>
         <w:numPr>
+          <w:ilvl w:val="0"/>
           <w:numId w:val="0"/>
         </w:numPr>
         <w:ind w:leftChars="0"/>
@@ -5427,6 +5441,7 @@
     <w:p>
       <w:pPr>
         <w:numPr>
+          <w:ilvl w:val="0"/>
           <w:numId w:val="0"/>
         </w:numPr>
         <w:ind w:leftChars="0"/>
@@ -5451,12 +5466,11 @@
         </w:rPr>
         <w:t>Tiền xử lý dữ liệu</w:t>
       </w:r>
-      <w:bookmarkStart w:id="1" w:name="_GoBack"/>
-      <w:bookmarkEnd w:id="1"/>
-    </w:p>
-    <w:p>
-      <w:pPr>
-        <w:numPr>
+    </w:p>
+    <w:p>
+      <w:pPr>
+        <w:numPr>
+          <w:ilvl w:val="0"/>
           <w:numId w:val="0"/>
         </w:numPr>
         <w:ind w:leftChars="0"/>
@@ -5488,6 +5502,7 @@
     <w:p>
       <w:pPr>
         <w:numPr>
+          <w:ilvl w:val="0"/>
           <w:numId w:val="0"/>
         </w:numPr>
         <w:ind w:leftChars="0"/>
@@ -5519,6 +5534,7 @@
     <w:p>
       <w:pPr>
         <w:numPr>
+          <w:ilvl w:val="0"/>
           <w:numId w:val="0"/>
         </w:numPr>
         <w:ind w:leftChars="0"/>
@@ -5556,6 +5572,7 @@
     <w:p>
       <w:pPr>
         <w:numPr>
+          <w:ilvl w:val="0"/>
           <w:numId w:val="0"/>
         </w:numPr>
         <w:ind w:leftChars="0"/>
@@ -5577,6 +5594,7 @@
     <w:p>
       <w:pPr>
         <w:numPr>
+          <w:ilvl w:val="0"/>
           <w:numId w:val="0"/>
         </w:numPr>
         <w:ind w:leftChars="0"/>
@@ -5598,6 +5616,7 @@
     <w:p>
       <w:pPr>
         <w:numPr>
+          <w:ilvl w:val="0"/>
           <w:numId w:val="0"/>
         </w:numPr>
         <w:ind w:leftChars="0"/>
@@ -5619,6 +5638,7 @@
     <w:p>
       <w:pPr>
         <w:numPr>
+          <w:ilvl w:val="0"/>
           <w:numId w:val="0"/>
         </w:numPr>
         <w:ind w:leftChars="0"/>
@@ -5644,6 +5664,7 @@
     <w:p>
       <w:pPr>
         <w:numPr>
+          <w:ilvl w:val="0"/>
           <w:numId w:val="0"/>
         </w:numPr>
         <w:ind w:leftChars="0"/>
@@ -5924,7 +5945,7 @@
     <w:lsdException w:unhideWhenUsed="0" w:uiPriority="0" w:semiHidden="0" w:name="HTML Sample"/>
     <w:lsdException w:unhideWhenUsed="0" w:uiPriority="0" w:semiHidden="0" w:name="HTML Typewriter"/>
     <w:lsdException w:unhideWhenUsed="0" w:uiPriority="0" w:semiHidden="0" w:name="HTML Variable"/>
-    <w:lsdException w:unhideWhenUsed="0" w:uiPriority="0" w:name="Normal Table"/>
+    <w:lsdException w:qFormat="1" w:unhideWhenUsed="0" w:uiPriority="0" w:name="Normal Table"/>
     <w:lsdException w:unhideWhenUsed="0" w:uiPriority="0" w:semiHidden="0" w:name="annotation subject"/>
     <w:lsdException w:unhideWhenUsed="0" w:uiPriority="0" w:semiHidden="0" w:name="Table Simple 1"/>
     <w:lsdException w:unhideWhenUsed="0" w:uiPriority="0" w:semiHidden="0" w:name="Table Simple 2"/>
@@ -6093,6 +6114,7 @@
   <w:style w:type="table" w:default="1" w:styleId="3">
     <w:name w:val="Normal Table"/>
     <w:semiHidden/>
+    <w:qFormat/>
     <w:uiPriority w:val="0"/>
     <w:tblPr>
       <w:tblCellMar>

</xml_diff>